<commit_message>
Mise à jour de la piste de score + début de la mise à jour du livret
</commit_message>
<xml_diff>
--- a/pictures/Score-Track-fr/Piste-de-Scores.docx
+++ b/pictures/Score-Track-fr/Piste-de-Scores.docx
@@ -808,10 +808,10 @@
           <w:noProof/>
         </w:rPr>
         <w:drawing>
-          <wp:inline distT="0" distB="0" distL="0" distR="0" wp14:anchorId="2E9E9547" wp14:editId="7C231F3D">
-            <wp:extent cx="7967980" cy="5078095"/>
-            <wp:effectExtent l="0" t="0" r="0" b="8255"/>
-            <wp:docPr id="1286949955" name="Image 1"/>
+          <wp:inline distT="0" distB="0" distL="0" distR="0" wp14:anchorId="5B86043D" wp14:editId="229463EF">
+            <wp:extent cx="7949565" cy="5066665"/>
+            <wp:effectExtent l="0" t="0" r="0" b="635"/>
+            <wp:docPr id="1660397045" name="Image 1"/>
             <wp:cNvGraphicFramePr>
               <a:graphicFrameLocks xmlns:a="http://schemas.openxmlformats.org/drawingml/2006/main" noChangeAspect="1"/>
             </wp:cNvGraphicFramePr>
@@ -819,13 +819,13 @@
               <a:graphicData uri="http://schemas.openxmlformats.org/drawingml/2006/picture">
                 <pic:pic xmlns:pic="http://schemas.openxmlformats.org/drawingml/2006/picture">
                   <pic:nvPicPr>
-                    <pic:cNvPr id="0" name="Picture 2"/>
+                    <pic:cNvPr id="0" name="Picture 1"/>
                     <pic:cNvPicPr>
                       <a:picLocks noChangeAspect="1" noChangeArrowheads="1"/>
                     </pic:cNvPicPr>
                   </pic:nvPicPr>
                   <pic:blipFill>
-                    <a:blip r:embed="rId41">
+                    <a:blip r:embed="rId41" cstate="print">
                       <a:extLst>
                         <a:ext uri="{28A0092B-C50C-407E-A947-70E740481C1C}">
                           <a14:useLocalDpi xmlns:a14="http://schemas.microsoft.com/office/drawing/2010/main" val="0"/>
@@ -840,12 +840,15 @@
                   <pic:spPr bwMode="auto">
                     <a:xfrm>
                       <a:off x="0" y="0"/>
-                      <a:ext cx="7967980" cy="5078095"/>
+                      <a:ext cx="7949565" cy="5066665"/>
                     </a:xfrm>
                     <a:prstGeom prst="rect">
                       <a:avLst/>
                     </a:prstGeom>
                     <a:noFill/>
+                    <a:ln>
+                      <a:noFill/>
+                    </a:ln>
                   </pic:spPr>
                 </pic:pic>
               </a:graphicData>

</xml_diff>